<commit_message>
dataset real world added
</commit_message>
<xml_diff>
--- a/Medical_AI_Documentation.docx
+++ b/Medical_AI_Documentation.docx
@@ -730,7 +730,7 @@
           <w:sz w:val="18"/>
           <w:szCs w:val="18"/>
         </w:rPr>
-        <w:t xml:space="preserve">│   └── data_generator.py       ← Synthetic data + preprocessing</w:t>
+        <w:t>│   ├── data_generator.py       ← Real-world dataset loader + SMOTE augmentation + calibrated fallback</w:t>
       </w:r>
     </w:p>
     <w:p>
@@ -749,7 +749,12 @@
           <w:sz w:val="18"/>
           <w:szCs w:val="18"/>
         </w:rPr>
-        <w:t xml:space="preserve">└── requirements.txt</w:t>
+        <w:t>│   ├── DATASET_DOCUMENTATION.md   ← Dataset sources, citations &amp; feature mapping</w:t>
+      </w:r>
+    </w:p>
+    <w:p>
+      <w:r>
+        <w:t>│   └── cache/                     ← Auto-downloaded raw CSV files (created on first run)</w:t>
       </w:r>
     </w:p>
     <w:p>
@@ -1855,13 +1860,7 @@
           </w:tcPr>
           <w:p>
             <w:r>
-              <w:rPr>
-                <w:rFonts w:ascii="Arial" w:cs="Arial" w:eastAsia="Arial" w:hAnsi="Arial"/>
-                <w:color w:val="2C2C2C"/>
-                <w:sz w:val="20"/>
-                <w:szCs w:val="20"/>
-              </w:rPr>
-              <w:t xml:space="preserve">Anemia</w:t>
+              <w:t>Anemia</w:t>
             </w:r>
           </w:p>
         </w:tc>
@@ -1884,13 +1883,7 @@
           </w:tcPr>
           <w:p>
             <w:r>
-              <w:rPr>
-                <w:rFonts w:ascii="Arial" w:cs="Arial" w:eastAsia="Arial" w:hAnsi="Arial"/>
-                <w:color w:val="2C2C2C"/>
-                <w:sz w:val="20"/>
-                <w:szCs w:val="20"/>
-              </w:rPr>
-              <w:t xml:space="preserve">100.00%</w:t>
+              <w:t>100.00%</w:t>
             </w:r>
           </w:p>
         </w:tc>
@@ -1913,13 +1906,7 @@
           </w:tcPr>
           <w:p>
             <w:r>
-              <w:rPr>
-                <w:rFonts w:ascii="Arial" w:cs="Arial" w:eastAsia="Arial" w:hAnsi="Arial"/>
-                <w:color w:val="2C2C2C"/>
-                <w:sz w:val="20"/>
-                <w:szCs w:val="20"/>
-              </w:rPr>
-              <w:t xml:space="preserve">100.00%</w:t>
+              <w:t>100.00%</w:t>
             </w:r>
           </w:p>
         </w:tc>
@@ -1942,13 +1929,7 @@
           </w:tcPr>
           <w:p>
             <w:r>
-              <w:rPr>
-                <w:rFonts w:ascii="Arial" w:cs="Arial" w:eastAsia="Arial" w:hAnsi="Arial"/>
-                <w:color w:val="2C2C2C"/>
-                <w:sz w:val="20"/>
-                <w:szCs w:val="20"/>
-              </w:rPr>
-              <w:t xml:space="preserve">1.000</w:t>
+              <w:t>0.995</w:t>
             </w:r>
           </w:p>
         </w:tc>
@@ -1971,13 +1952,7 @@
           </w:tcPr>
           <w:p>
             <w:r>
-              <w:rPr>
-                <w:rFonts w:ascii="Arial" w:cs="Arial" w:eastAsia="Arial" w:hAnsi="Arial"/>
-                <w:color w:val="2C2C2C"/>
-                <w:sz w:val="20"/>
-                <w:szCs w:val="20"/>
-              </w:rPr>
-              <w:t xml:space="preserve">2,000</w:t>
+              <w:t>2,000 (calibrated clinical data)</w:t>
             </w:r>
           </w:p>
         </w:tc>
@@ -2002,13 +1977,7 @@
           </w:tcPr>
           <w:p>
             <w:r>
-              <w:rPr>
-                <w:rFonts w:ascii="Arial" w:cs="Arial" w:eastAsia="Arial" w:hAnsi="Arial"/>
-                <w:color w:val="2C2C2C"/>
-                <w:sz w:val="20"/>
-                <w:szCs w:val="20"/>
-              </w:rPr>
-              <w:t xml:space="preserve">Diabetes</w:t>
+              <w:t>Diabetes</w:t>
             </w:r>
           </w:p>
         </w:tc>
@@ -2031,13 +2000,7 @@
           </w:tcPr>
           <w:p>
             <w:r>
-              <w:rPr>
-                <w:rFonts w:ascii="Arial" w:cs="Arial" w:eastAsia="Arial" w:hAnsi="Arial"/>
-                <w:color w:val="2C2C2C"/>
-                <w:sz w:val="20"/>
-                <w:szCs w:val="20"/>
-              </w:rPr>
-              <w:t xml:space="preserve">100.00%</w:t>
+              <w:t>80.00%</w:t>
             </w:r>
           </w:p>
         </w:tc>
@@ -2060,13 +2023,7 @@
           </w:tcPr>
           <w:p>
             <w:r>
-              <w:rPr>
-                <w:rFonts w:ascii="Arial" w:cs="Arial" w:eastAsia="Arial" w:hAnsi="Arial"/>
-                <w:color w:val="2C2C2C"/>
-                <w:sz w:val="20"/>
-                <w:szCs w:val="20"/>
-              </w:rPr>
-              <w:t xml:space="preserve">100.00%</w:t>
+              <w:t>80.30%</w:t>
             </w:r>
           </w:p>
         </w:tc>
@@ -2089,13 +2046,7 @@
           </w:tcPr>
           <w:p>
             <w:r>
-              <w:rPr>
-                <w:rFonts w:ascii="Arial" w:cs="Arial" w:eastAsia="Arial" w:hAnsi="Arial"/>
-                <w:color w:val="2C2C2C"/>
-                <w:sz w:val="20"/>
-                <w:szCs w:val="20"/>
-              </w:rPr>
-              <w:t xml:space="preserve">0.998</w:t>
+              <w:t>0.874</w:t>
             </w:r>
           </w:p>
         </w:tc>
@@ -2118,13 +2069,7 @@
           </w:tcPr>
           <w:p>
             <w:r>
-              <w:rPr>
-                <w:rFonts w:ascii="Arial" w:cs="Arial" w:eastAsia="Arial" w:hAnsi="Arial"/>
-                <w:color w:val="2C2C2C"/>
-                <w:sz w:val="20"/>
-                <w:szCs w:val="20"/>
-              </w:rPr>
-              <w:t xml:space="preserve">2,000</w:t>
+              <w:t>2,000 (Pima Indians — real)</w:t>
             </w:r>
           </w:p>
         </w:tc>
@@ -2149,13 +2094,7 @@
           </w:tcPr>
           <w:p>
             <w:r>
-              <w:rPr>
-                <w:rFonts w:ascii="Arial" w:cs="Arial" w:eastAsia="Arial" w:hAnsi="Arial"/>
-                <w:color w:val="2C2C2C"/>
-                <w:sz w:val="20"/>
-                <w:szCs w:val="20"/>
-              </w:rPr>
-              <w:t xml:space="preserve">Infection</w:t>
+              <w:t>Infection</w:t>
             </w:r>
           </w:p>
         </w:tc>
@@ -2178,13 +2117,7 @@
           </w:tcPr>
           <w:p>
             <w:r>
-              <w:rPr>
-                <w:rFonts w:ascii="Arial" w:cs="Arial" w:eastAsia="Arial" w:hAnsi="Arial"/>
-                <w:color w:val="2C2C2C"/>
-                <w:sz w:val="20"/>
-                <w:szCs w:val="20"/>
-              </w:rPr>
-              <w:t xml:space="preserve">100.00%</w:t>
+              <w:t>100.00%</w:t>
             </w:r>
           </w:p>
         </w:tc>
@@ -2207,13 +2140,7 @@
           </w:tcPr>
           <w:p>
             <w:r>
-              <w:rPr>
-                <w:rFonts w:ascii="Arial" w:cs="Arial" w:eastAsia="Arial" w:hAnsi="Arial"/>
-                <w:color w:val="2C2C2C"/>
-                <w:sz w:val="20"/>
-                <w:szCs w:val="20"/>
-              </w:rPr>
-              <w:t xml:space="preserve">100.00%</w:t>
+              <w:t>100.00%</w:t>
             </w:r>
           </w:p>
         </w:tc>
@@ -2236,13 +2163,7 @@
           </w:tcPr>
           <w:p>
             <w:r>
-              <w:rPr>
-                <w:rFonts w:ascii="Arial" w:cs="Arial" w:eastAsia="Arial" w:hAnsi="Arial"/>
-                <w:color w:val="2C2C2C"/>
-                <w:sz w:val="20"/>
-                <w:szCs w:val="20"/>
-              </w:rPr>
-              <w:t xml:space="preserve">0.999</w:t>
+              <w:t>1.000</w:t>
             </w:r>
           </w:p>
         </w:tc>
@@ -2265,13 +2186,7 @@
           </w:tcPr>
           <w:p>
             <w:r>
-              <w:rPr>
-                <w:rFonts w:ascii="Arial" w:cs="Arial" w:eastAsia="Arial" w:hAnsi="Arial"/>
-                <w:color w:val="2C2C2C"/>
-                <w:sz w:val="20"/>
-                <w:szCs w:val="20"/>
-              </w:rPr>
-              <w:t xml:space="preserve">2,000</w:t>
+              <w:t>2,000 (calibrated clinical data)</w:t>
             </w:r>
           </w:p>
         </w:tc>
@@ -2296,13 +2211,7 @@
           </w:tcPr>
           <w:p>
             <w:r>
-              <w:rPr>
-                <w:rFonts w:ascii="Arial" w:cs="Arial" w:eastAsia="Arial" w:hAnsi="Arial"/>
-                <w:color w:val="2C2C2C"/>
-                <w:sz w:val="20"/>
-                <w:szCs w:val="20"/>
-              </w:rPr>
-              <w:t xml:space="preserve">Cholesterol</w:t>
+              <w:t>Cholesterol</w:t>
             </w:r>
           </w:p>
         </w:tc>
@@ -2325,13 +2234,7 @@
           </w:tcPr>
           <w:p>
             <w:r>
-              <w:rPr>
-                <w:rFonts w:ascii="Arial" w:cs="Arial" w:eastAsia="Arial" w:hAnsi="Arial"/>
-                <w:color w:val="2C2C2C"/>
-                <w:sz w:val="20"/>
-                <w:szCs w:val="20"/>
-              </w:rPr>
-              <w:t xml:space="preserve">100.00%</w:t>
+              <w:t>92.50%</w:t>
             </w:r>
           </w:p>
         </w:tc>
@@ -2354,13 +2257,7 @@
           </w:tcPr>
           <w:p>
             <w:r>
-              <w:rPr>
-                <w:rFonts w:ascii="Arial" w:cs="Arial" w:eastAsia="Arial" w:hAnsi="Arial"/>
-                <w:color w:val="2C2C2C"/>
-                <w:sz w:val="20"/>
-                <w:szCs w:val="20"/>
-              </w:rPr>
-              <w:t xml:space="preserve">100.00%</w:t>
+              <w:t>92.20%</w:t>
             </w:r>
           </w:p>
         </w:tc>
@@ -2383,13 +2280,7 @@
           </w:tcPr>
           <w:p>
             <w:r>
-              <w:rPr>
-                <w:rFonts w:ascii="Arial" w:cs="Arial" w:eastAsia="Arial" w:hAnsi="Arial"/>
-                <w:color w:val="2C2C2C"/>
-                <w:sz w:val="20"/>
-                <w:szCs w:val="20"/>
-              </w:rPr>
-              <w:t xml:space="preserve">0.999</w:t>
+              <w:t>0.983</w:t>
             </w:r>
           </w:p>
         </w:tc>
@@ -2412,13 +2303,7 @@
           </w:tcPr>
           <w:p>
             <w:r>
-              <w:rPr>
-                <w:rFonts w:ascii="Arial" w:cs="Arial" w:eastAsia="Arial" w:hAnsi="Arial"/>
-                <w:color w:val="2C2C2C"/>
-                <w:sz w:val="20"/>
-                <w:szCs w:val="20"/>
-              </w:rPr>
-              <w:t xml:space="preserve">2,000</w:t>
+              <w:t>2,000 (Cleveland Heart Disease — real)</w:t>
             </w:r>
           </w:p>
         </w:tc>
@@ -2503,7 +2388,23 @@
           <w:sz w:val="22"/>
           <w:szCs w:val="22"/>
         </w:rPr>
-        <w:t xml:space="preserve">Synthetic data generation from clinical reference ranges — balanced classes</w:t>
+        <w:t>Real-world datasets — Pima Indians (diabetes), Cleveland Heart Disease (cholesterol), Kaggle Anemia Blood Test; with calibrated clinical data fallback for infection</w:t>
+      </w:r>
+    </w:p>
+    <w:p>
+      <w:pPr>
+        <w:pStyle w:val="ListParagraph"/>
+      </w:pPr>
+      <w:r>
+        <w:t>L2 Regularisation (Ridge penalty) — prevents overfitting on smaller, noisier real-world datasets; applied to all 4 models</w:t>
+      </w:r>
+    </w:p>
+    <w:p>
+      <w:pPr>
+        <w:pStyle w:val="ListParagraph"/>
+      </w:pPr>
+      <w:r>
+        <w:t>SMOTE-inspired augmentation — interpolates between real patient samples to produce 2,000 balanced training instances per disease</w:t>
       </w:r>
     </w:p>
     <w:p>
@@ -8944,15 +8845,19 @@
               <w:spacing w:after="80"/>
             </w:pPr>
             <w:r>
-              <w:rPr>
-                <w:rFonts w:ascii="Arial" w:cs="Arial" w:eastAsia="Arial" w:hAnsi="Arial"/>
-                <w:b/>
-                <w:bCs/>
-                <w:color w:val="1B6B3A"/>
-                <w:sz w:val="20"/>
-                <w:szCs w:val="20"/>
-              </w:rPr>
-              <w:t xml:space="preserve">Response — 200 OK</w:t>
+              <w:t>Response — 200 OK</w:t>
+              <w:br/>
+              <w:t>{</w:t>
+              <w:br/>
+              <w:t xml:space="preserve">  "anemia":      { "accuracy": 1.000, "f1_score": 1.000, "auc": 0.995 },</w:t>
+              <w:br/>
+              <w:t xml:space="preserve">  "diabetes":    { "accuracy": 0.800, "f1_score": 0.803, "auc": 0.874 },</w:t>
+              <w:br/>
+              <w:t xml:space="preserve">  "infection":   { "accuracy": 1.000, "f1_score": 1.000, "auc": 1.000 },</w:t>
+              <w:br/>
+              <w:t xml:space="preserve">  "cholesterol": { "accuracy": 0.925, "f1_score": 0.922, "auc": 0.983 }</w:t>
+              <w:br/>
+              <w:t>}</w:t>
             </w:r>
           </w:p>
           <w:p>
@@ -10985,7 +10890,7 @@
           <w:sz w:val="22"/>
           <w:szCs w:val="22"/>
         </w:rPr>
-        <w:t xml:space="preserve">This is repeated for 2000 iterations per model. The learning rate (0.05) controls step size.</w:t>
+        <w:t>This is repeated for 3,000–5,000 iterations depending on the disease model. Learning rates range from 0.03 to 0.05. L2 regularisation (lambda = 0.005–0.01) is applied to prevent overfitting on real-world noisy data.</w:t>
       </w:r>
     </w:p>
     <w:p>
@@ -11082,7 +10987,7 @@
           <w:sz w:val="28"/>
           <w:szCs w:val="28"/>
         </w:rPr>
-        <w:t xml:space="preserve">3.4  Synthetic Data — Why and How</w:t>
+        <w:t>3.4  Training Data — Real-World Datasets &amp; Calibrated Fallback</w:t>
       </w:r>
     </w:p>
     <w:p>
@@ -11098,7 +11003,7 @@
           <w:sz w:val="24"/>
           <w:szCs w:val="24"/>
         </w:rPr>
-        <w:t xml:space="preserve">Why synthetic data?</w:t>
+        <w:t>What data sources does the system train on?</w:t>
       </w:r>
     </w:p>
     <w:p>
@@ -11117,7 +11022,7 @@
           <w:sz w:val="22"/>
           <w:szCs w:val="22"/>
         </w:rPr>
-        <w:t xml:space="preserve">Real medical data is scarce, private, and ethically restricted</w:t>
+        <w:t>Diabetes — Pima Indians Diabetes Database (Smith et al., 1988): 768 real adult patients; fasting glucose, insulin, BMI, age, blood pressure, outcome label</w:t>
       </w:r>
     </w:p>
     <w:p>
@@ -11136,7 +11041,7 @@
           <w:sz w:val="22"/>
           <w:szCs w:val="22"/>
         </w:rPr>
-        <w:t xml:space="preserve">Available public datasets are often small and imbalanced</w:t>
+        <w:t>Anemia — Kaggle Anemia Blood Test Dataset (~1,421 real patients): haemoglobin, MCH, MCHC, MCV; RBC / haematocrit / ferritin are derived via validated clinical formulas</w:t>
       </w:r>
     </w:p>
     <w:p>
@@ -11155,7 +11060,7 @@
           <w:sz w:val="22"/>
           <w:szCs w:val="22"/>
         </w:rPr>
-        <w:t xml:space="preserve">Synthetic data allows complete class balance (50% positive, 50% negative)</w:t>
+        <w:t>Cholesterol — Cleveland Heart Disease Dataset (Detrano et al., 1989): 303 real patients; serum total cholesterol used; LDL/HDL/TG derived via NHANES III calibrated regressions; label = TC &gt;= 200 mg/dL (ACC/AHA borderline-high threshold)</w:t>
       </w:r>
     </w:p>
     <w:p>
@@ -11174,7 +11079,7 @@
           <w:sz w:val="22"/>
           <w:szCs w:val="22"/>
         </w:rPr>
-        <w:t xml:space="preserve">Edge cases can be deliberately included to improve model robustness</w:t>
+        <w:t>Infection — Calibrated clinical distributions from peer-reviewed literature: Pierrakos &amp; Vincent (Critical Care, 2010), Wacker et al. (Lancet Infect Dis, 2013), NHANES 2017-2020 CBC reference ranges. No single public dataset covers all 6 markers.</w:t>
       </w:r>
     </w:p>
     <w:p>
@@ -11198,7 +11103,7 @@
           <w:sz w:val="24"/>
           <w:szCs w:val="24"/>
         </w:rPr>
-        <w:t xml:space="preserve">How is it generated?</w:t>
+        <w:t>How are missing features derived?</w:t>
       </w:r>
     </w:p>
     <w:p>
@@ -11212,7 +11117,7 @@
           <w:sz w:val="22"/>
           <w:szCs w:val="22"/>
         </w:rPr>
-        <w:t xml:space="preserve">Each disease has two Gaussian distributions per feature — one for the healthy class and one for the diseased class. The mean and standard deviation of each distribution are based on published clinical reference ranges.</w:t>
+        <w:t>Features not present in source datasets are computed using medically validated formulas:</w:t>
       </w:r>
     </w:p>
     <w:p>
@@ -11234,7 +11139,7 @@
           <w:sz w:val="22"/>
           <w:szCs w:val="22"/>
         </w:rPr>
-        <w:t xml:space="preserve">Example for Anemia — Hemoglobin:</w:t>
+        <w:t>RBC (M/uL) = Haemoglobin x 10 / MCH   [from MCH definition: MCH = Hgb/RBC x 10]</w:t>
       </w:r>
     </w:p>
     <w:p>
@@ -11253,7 +11158,7 @@
           <w:sz w:val="18"/>
           <w:szCs w:val="18"/>
         </w:rPr>
-        <w:t xml:space="preserve">Healthy:  mean = 14.0 g/dL, std = 1.2  (Normal range: 12-17)</w:t>
+        <w:t>Haematocrit (%) = Haemoglobin x 3   [Wintrobe's rule, accurate to ±1%]</w:t>
       </w:r>
     </w:p>
     <w:p>
@@ -11272,7 +11177,7 @@
           <w:sz w:val="18"/>
           <w:szCs w:val="18"/>
         </w:rPr>
-        <w:t xml:space="preserve">Anemic:   mean =  9.5 g/dL, std = 1.5  (Anemia: &lt; 12 for women)</w:t>
+        <w:t>HbA1c (%) = 0.026 x Fasting Glucose (mg/dL) + 3.59   [Sacks et al., 2011]</w:t>
       </w:r>
     </w:p>
     <w:p>
@@ -11286,7 +11191,7 @@
           <w:sz w:val="22"/>
           <w:szCs w:val="22"/>
         </w:rPr>
-        <w:t xml:space="preserve">2000 samples are generated per disease (1000 healthy + 1000 diseased), shuffled, and split 80/20 into train and test.</w:t>
+        <w:t>If a dataset cannot be downloaded at runtime, the system automatically falls back to calibrated distributions whose parameters are sourced from published clinical reference ranges. Downloaded files are cached in data/cache/ — delete to force a fresh download. Each class is then augmented to 1,000 samples using SMOTE-inspired interpolation, giving 2,000 balanced training samples per disease.</w:t>
       </w:r>
     </w:p>
     <w:p>
@@ -11669,13 +11574,7 @@
           </w:tcPr>
           <w:p>
             <w:r>
-              <w:rPr>
-                <w:rFonts w:ascii="Arial" w:cs="Arial" w:eastAsia="Arial" w:hAnsi="Arial"/>
-                <w:color w:val="2C2C2C"/>
-                <w:sz w:val="20"/>
-                <w:szCs w:val="20"/>
-              </w:rPr>
-              <w:t xml:space="preserve">Why synthetic data?</w:t>
+              <w:t>What real-world datasets do you use?</w:t>
             </w:r>
           </w:p>
         </w:tc>
@@ -11698,13 +11597,7 @@
           </w:tcPr>
           <w:p>
             <w:r>
-              <w:rPr>
-                <w:rFonts w:ascii="Arial" w:cs="Arial" w:eastAsia="Arial" w:hAnsi="Arial"/>
-                <w:color w:val="2C2C2C"/>
-                <w:sz w:val="20"/>
-                <w:szCs w:val="20"/>
-              </w:rPr>
-              <w:t xml:space="preserve">Real medical data is privacy-restricted and often imbalanced. Synthetic data generated from clinical reference ranges gives us balanced, realistic training data.</w:t>
+              <w:t>Pima Indians Diabetes (768 patients), Cleveland Heart Disease (303 patients, for cholesterol), and Kaggle Anemia Blood Test (~1,421 patients). For infection, where no single public dataset covers all 6 markers, we use calibrated distributions sourced from published clinical literature (NHANES, Pierrakos &amp; Vincent 2010).</w:t>
             </w:r>
           </w:p>
         </w:tc>
@@ -12029,13 +11922,7 @@
           </w:tcPr>
           <w:p>
             <w:r>
-              <w:rPr>
-                <w:rFonts w:ascii="Arial" w:cs="Arial" w:eastAsia="Arial" w:hAnsi="Arial"/>
-                <w:color w:val="2C2C2C"/>
-                <w:sz w:val="20"/>
-                <w:szCs w:val="20"/>
-              </w:rPr>
-              <w:t xml:space="preserve">Why is accuracy 100% on synthetic data?</w:t>
+              <w:t>Why is accuracy lower for diabetes (~80%) than other diseases?</w:t>
             </w:r>
           </w:p>
         </w:tc>
@@ -12058,13 +11945,7 @@
           </w:tcPr>
           <w:p>
             <w:r>
-              <w:rPr>
-                <w:rFonts w:ascii="Arial" w:cs="Arial" w:eastAsia="Arial" w:hAnsi="Arial"/>
-                <w:color w:val="2C2C2C"/>
-                <w:sz w:val="20"/>
-                <w:szCs w:val="20"/>
-              </w:rPr>
-              <w:t xml:space="preserve">Synthetic data has clean, well-separated class distributions based on reference ranges. Real-world data would produce lower (but still strong) accuracy due to noise and borderline cases.</w:t>
+              <w:t>Diabetes uses real Pima Indians data (768 patients), which has overlapping class distributions — a well-known challenge in medical ML. ~80% is the established benchmark for logistic regression on this dataset. Anemia and infection use well-separated calibrated distributions, giving higher accuracy. Cholesterol achieves ~92.5% because the Cleveland TC values form clear ACC/AHA risk tiers.</w:t>
             </w:r>
           </w:p>
         </w:tc>
@@ -12125,6 +12006,102 @@
                 <w:szCs w:val="20"/>
               </w:rPr>
               <w:t xml:space="preserve">Python runs a Flask REST API. The .NET backend POSTs OCR-extracted JSON lab values to /predict and receives a structured JSON response with risk level and recommendations.</w:t>
+            </w:r>
+          </w:p>
+        </w:tc>
+      </w:tr>
+      <w:tr>
+        <w:tc>
+          <w:tcPr>
+            <w:tcW w:type="dxa" w:w="3400"/>
+            <w:tcBorders>
+              <w:top w:val="single" w:color="CCCCCC" w:sz="1"/>
+              <w:left w:val="single" w:color="CCCCCC" w:sz="1"/>
+              <w:bottom w:val="single" w:color="CCCCCC" w:sz="1"/>
+              <w:right w:val="single" w:color="CCCCCC" w:sz="1"/>
+            </w:tcBorders>
+            <w:shd w:fill="F4F4F4" w:val="clear"/>
+            <w:tcMar>
+              <w:top w:type="dxa" w:w="80"/>
+              <w:left w:type="dxa" w:w="120"/>
+              <w:bottom w:type="dxa" w:w="80"/>
+              <w:right w:type="dxa" w:w="120"/>
+            </w:tcMar>
+          </w:tcPr>
+          <w:p>
+            <w:r>
+              <w:t>What is SMOTE augmentation and why use it?</w:t>
+            </w:r>
+          </w:p>
+        </w:tc>
+        <w:tc>
+          <w:tcPr>
+            <w:tcW w:type="dxa" w:w="5960"/>
+            <w:tcBorders>
+              <w:top w:val="single" w:color="CCCCCC" w:sz="1"/>
+              <w:left w:val="single" w:color="CCCCCC" w:sz="1"/>
+              <w:bottom w:val="single" w:color="CCCCCC" w:sz="1"/>
+              <w:right w:val="single" w:color="CCCCCC" w:sz="1"/>
+            </w:tcBorders>
+            <w:shd w:fill="F4F4F4" w:val="clear"/>
+            <w:tcMar>
+              <w:top w:type="dxa" w:w="80"/>
+              <w:left w:type="dxa" w:w="120"/>
+              <w:bottom w:type="dxa" w:w="80"/>
+              <w:right w:type="dxa" w:w="120"/>
+            </w:tcMar>
+          </w:tcPr>
+          <w:p>
+            <w:r>
+              <w:t>SMOTE (Synthetic Minority Oversampling Technique, Chawla et al. 2002) creates new training samples by interpolating between pairs of real same-class patients: x_synth = x_a * alpha + x_b * (1-alpha), alpha ~ Uniform(0,1). This allows us to reach 2,000 balanced training samples even when the source dataset has only 300-768 rows, while keeping the synthetic data within the real data distribution.</w:t>
+            </w:r>
+          </w:p>
+        </w:tc>
+      </w:tr>
+      <w:tr>
+        <w:tc>
+          <w:tcPr>
+            <w:tcW w:type="dxa" w:w="3400"/>
+            <w:tcBorders>
+              <w:top w:val="single" w:color="CCCCCC" w:sz="1"/>
+              <w:left w:val="single" w:color="CCCCCC" w:sz="1"/>
+              <w:bottom w:val="single" w:color="CCCCCC" w:sz="1"/>
+              <w:right w:val="single" w:color="CCCCCC" w:sz="1"/>
+            </w:tcBorders>
+            <w:shd w:fill="F4F4F4" w:val="clear"/>
+            <w:tcMar>
+              <w:top w:type="dxa" w:w="80"/>
+              <w:left w:type="dxa" w:w="120"/>
+              <w:bottom w:type="dxa" w:w="80"/>
+              <w:right w:type="dxa" w:w="120"/>
+            </w:tcMar>
+          </w:tcPr>
+          <w:p>
+            <w:r>
+              <w:t>What is L2 regularisation and why add it?</w:t>
+            </w:r>
+          </w:p>
+        </w:tc>
+        <w:tc>
+          <w:tcPr>
+            <w:tcW w:type="dxa" w:w="5960"/>
+            <w:tcBorders>
+              <w:top w:val="single" w:color="CCCCCC" w:sz="1"/>
+              <w:left w:val="single" w:color="CCCCCC" w:sz="1"/>
+              <w:bottom w:val="single" w:color="CCCCCC" w:sz="1"/>
+              <w:right w:val="single" w:color="CCCCCC" w:sz="1"/>
+            </w:tcBorders>
+            <w:shd w:fill="F4F4F4" w:val="clear"/>
+            <w:tcMar>
+              <w:top w:type="dxa" w:w="80"/>
+              <w:left w:type="dxa" w:w="120"/>
+              <w:bottom w:type="dxa" w:w="80"/>
+              <w:right w:type="dxa" w:w="120"/>
+            </w:tcMar>
+          </w:tcPr>
+          <w:p>
+            <w:r>
+              <w:t>L2 (Ridge) regularisation adds a penalty term (lambda/2n)||w||^2 to the loss function. The updated gradient is: dw = (X.T * delta)/n + lambda * w / n. This shrinks large weights and prevents the model from over-fitting the noise in smaller real-world datasets. Each disease model uses lambda = 0.005-0.01 tuned for its dataset size and difficulty.</w:t>
             </w:r>
           </w:p>
         </w:tc>
@@ -12171,7 +12148,7 @@
           <w:sz w:val="22"/>
           <w:szCs w:val="22"/>
         </w:rPr>
-        <w:t xml:space="preserve">Synthetic data produces ideal accuracy — real hospital data would produce realistic but lower metrics</w:t>
+        <w:t>Diabetes achieves ~80% accuracy on real data — not 100%. This is realistic for logistic regression on the Pima Indians benchmark; the earlier 100% was an artefact of perfectly separated synthetic Gaussian distributions, not achievable on real data</w:t>
       </w:r>
     </w:p>
     <w:p>

</xml_diff>